<commit_message>
Explanation of how got to my dataset
A new dot plot explaining in multiple seasons
</commit_message>
<xml_diff>
--- a/capstone project.docx
+++ b/capstone project.docx
@@ -1305,13 +1305,13 @@
       </w:pPr>
       <w:r>
         <w:rPr>
-          <w:noProof/>
+          <w:rFonts w:ascii="Times New Roman" w:hAnsi="Times New Roman" w:cs="Times New Roman"/>
         </w:rPr>
         <w:drawing>
-          <wp:inline distT="0" distB="0" distL="0" distR="0" wp14:anchorId="5C4AABDC" wp14:editId="5CD661DF">
-            <wp:extent cx="4489450" cy="2138953"/>
-            <wp:effectExtent l="0" t="0" r="6350" b="0"/>
-            <wp:docPr id="1574155039" name="Picture 1"/>
+          <wp:inline distT="0" distB="0" distL="0" distR="0" wp14:anchorId="0F317013" wp14:editId="4A925010">
+            <wp:extent cx="3162300" cy="2123403"/>
+            <wp:effectExtent l="0" t="0" r="0" b="0"/>
+            <wp:docPr id="2110600244" name="Picture 1"/>
             <wp:cNvGraphicFramePr>
               <a:graphicFrameLocks xmlns:a="http://schemas.openxmlformats.org/drawingml/2006/main" noChangeAspect="1"/>
             </wp:cNvGraphicFramePr>
@@ -1319,7 +1319,7 @@
               <a:graphicData uri="http://schemas.openxmlformats.org/drawingml/2006/picture">
                 <pic:pic xmlns:pic="http://schemas.openxmlformats.org/drawingml/2006/picture">
                   <pic:nvPicPr>
-                    <pic:cNvPr id="1574155039" name=""/>
+                    <pic:cNvPr id="2110600244" name=""/>
                     <pic:cNvPicPr/>
                   </pic:nvPicPr>
                   <pic:blipFill>
@@ -1331,7 +1331,7 @@
                   <pic:spPr>
                     <a:xfrm>
                       <a:off x="0" y="0"/>
-                      <a:ext cx="4602394" cy="2192764"/>
+                      <a:ext cx="3181091" cy="2136021"/>
                     </a:xfrm>
                     <a:prstGeom prst="rect">
                       <a:avLst/>
@@ -1410,51 +1410,25 @@
       <w:pPr>
         <w:rPr>
           <w:rFonts w:ascii="Times New Roman" w:hAnsi="Times New Roman" w:cs="Times New Roman"/>
-        </w:rPr>
-      </w:pPr>
-      <w:r>
-        <w:rPr>
-          <w:rFonts w:ascii="Times New Roman" w:hAnsi="Times New Roman" w:cs="Times New Roman"/>
-        </w:rPr>
-        <w:t xml:space="preserve">The </w:t>
-      </w:r>
-      <w:r>
-        <w:rPr>
-          <w:rFonts w:ascii="Times New Roman" w:hAnsi="Times New Roman" w:cs="Times New Roman"/>
-        </w:rPr>
-        <w:t>d</w:t>
-      </w:r>
-      <w:r>
-        <w:rPr>
-          <w:rFonts w:ascii="Times New Roman" w:hAnsi="Times New Roman" w:cs="Times New Roman"/>
-        </w:rPr>
-        <w:t>o</w:t>
-      </w:r>
-      <w:r>
-        <w:rPr>
-          <w:rFonts w:ascii="Times New Roman" w:hAnsi="Times New Roman" w:cs="Times New Roman"/>
-        </w:rPr>
-        <w:t>t</w:t>
-      </w:r>
-      <w:r>
-        <w:rPr>
-          <w:rFonts w:ascii="Times New Roman" w:hAnsi="Times New Roman" w:cs="Times New Roman"/>
-        </w:rPr>
-        <w:t xml:space="preserve"> plot further emphasizes the skewness of the target variable, showing a low median and multiple high-value outliers. These outliers likely correspond to players experiencing significant injuries or other external factors not captured in the dataset. The concentration of observations near the lower range, combined with high variability in the upper range, introduces noise that weakens model performance and helps explain the consistently low R² values observed across models.</w:t>
+          <w:b/>
+          <w:bCs/>
+        </w:rPr>
+      </w:pPr>
+      <w:r>
+        <w:rPr>
+          <w:rFonts w:ascii="Times New Roman" w:hAnsi="Times New Roman" w:cs="Times New Roman"/>
+        </w:rPr>
+        <w:t>This plot shows the distribution of games missed by players across different seasons. Most players missed relatively few games (0–5), indicating consistent participation, while a smaller number of players missed a higher number of games, which may reflect injuries or other availability factors. The variation across seasons suggests that player availability differs year to year but generally follows a similar pattern.</w:t>
       </w:r>
     </w:p>
     <w:p>
       <w:pPr>
         <w:rPr>
           <w:rFonts w:ascii="Times New Roman" w:hAnsi="Times New Roman" w:cs="Times New Roman"/>
-        </w:rPr>
-      </w:pPr>
-      <w:r>
-        <w:rPr>
-          <w:rFonts w:ascii="Times New Roman" w:hAnsi="Times New Roman" w:cs="Times New Roman"/>
-        </w:rPr>
-        <w:t>These findings suggest that while performance metrics capture player productivity, they do not adequately explain variability in player availability, which is likely driven by external factors such as injuries.</w:t>
-      </w:r>
+          <w:b/>
+          <w:bCs/>
+        </w:rPr>
+      </w:pPr>
     </w:p>
     <w:p>
       <w:pPr>
@@ -1482,66 +1456,48 @@
           <w:bCs/>
         </w:rPr>
       </w:pPr>
+      <w:r>
+        <w:rPr>
+          <w:rFonts w:ascii="Times New Roman" w:hAnsi="Times New Roman" w:cs="Times New Roman"/>
+          <w:b/>
+          <w:bCs/>
+        </w:rPr>
+        <w:t>3. Data Preparation and Preprocessing</w:t>
+      </w:r>
     </w:p>
     <w:p>
       <w:pPr>
         <w:rPr>
           <w:rFonts w:ascii="Times New Roman" w:hAnsi="Times New Roman" w:cs="Times New Roman"/>
-          <w:b/>
-          <w:bCs/>
-        </w:rPr>
-      </w:pPr>
+        </w:rPr>
+      </w:pPr>
+      <w:r>
+        <w:rPr>
+          <w:rFonts w:ascii="Times New Roman" w:hAnsi="Times New Roman" w:cs="Times New Roman"/>
+        </w:rPr>
+        <w:t>The raw multi</w:t>
+      </w:r>
+      <w:r>
+        <w:rPr>
+          <w:rFonts w:ascii="Times New Roman" w:hAnsi="Times New Roman" w:cs="Times New Roman"/>
+        </w:rPr>
+        <w:noBreakHyphen/>
+        <w:t>season dataset was exported from the Clarkson Athletics website and combined into a single CSV file (clarkson_mhockey_all_seasons.csv). The following cleaning and preparation steps were applied to transform the raw data into a modeling</w:t>
+      </w:r>
+      <w:r>
+        <w:rPr>
+          <w:rFonts w:ascii="Times New Roman" w:hAnsi="Times New Roman" w:cs="Times New Roman"/>
+        </w:rPr>
+        <w:noBreakHyphen/>
+        <w:t>ready dataset.</w:t>
+      </w:r>
     </w:p>
     <w:p>
       <w:pPr>
-        <w:rPr>
-          <w:rFonts w:ascii="Times New Roman" w:hAnsi="Times New Roman" w:cs="Times New Roman"/>
-          <w:b/>
-          <w:bCs/>
-        </w:rPr>
-      </w:pPr>
-      <w:r>
-        <w:rPr>
-          <w:rFonts w:ascii="Times New Roman" w:hAnsi="Times New Roman" w:cs="Times New Roman"/>
-          <w:b/>
-          <w:bCs/>
-        </w:rPr>
+        <w:pStyle w:val="NormalWeb"/>
+      </w:pPr>
+      <w:r>
         <w:lastRenderedPageBreak/>
-        <w:t>3. Data Preparation and Preprocessing</w:t>
-      </w:r>
-    </w:p>
-    <w:p>
-      <w:pPr>
-        <w:rPr>
-          <w:rFonts w:ascii="Times New Roman" w:hAnsi="Times New Roman" w:cs="Times New Roman"/>
-        </w:rPr>
-      </w:pPr>
-      <w:r>
-        <w:rPr>
-          <w:rFonts w:ascii="Times New Roman" w:hAnsi="Times New Roman" w:cs="Times New Roman"/>
-        </w:rPr>
-        <w:t>The raw multi</w:t>
-      </w:r>
-      <w:r>
-        <w:rPr>
-          <w:rFonts w:ascii="Times New Roman" w:hAnsi="Times New Roman" w:cs="Times New Roman"/>
-        </w:rPr>
-        <w:noBreakHyphen/>
-        <w:t>season dataset was exported from the Clarkson Athletics website and combined into a single CSV file (clarkson_mhockey_all_seasons.csv). The following cleaning and preparation steps were applied to transform the raw data into a modeling</w:t>
-      </w:r>
-      <w:r>
-        <w:rPr>
-          <w:rFonts w:ascii="Times New Roman" w:hAnsi="Times New Roman" w:cs="Times New Roman"/>
-        </w:rPr>
-        <w:noBreakHyphen/>
-        <w:t>ready dataset.</w:t>
-      </w:r>
-    </w:p>
-    <w:p>
-      <w:pPr>
-        <w:pStyle w:val="NormalWeb"/>
-      </w:pPr>
-      <w:r>
         <w:t>Data cleaning included removing non-player rows, standardizing feature names, and excluding players with zero games played. Goalies were removed due to incompatible statistical structures.</w:t>
       </w:r>
       <w:r>
@@ -1926,7 +1882,6 @@
         <w:rPr>
           <w:rFonts w:ascii="Times New Roman" w:hAnsi="Times New Roman" w:cs="Times New Roman"/>
         </w:rPr>
-        <w:lastRenderedPageBreak/>
         <w:t xml:space="preserve">Creating Points and Points per </w:t>
       </w:r>
       <w:r>
@@ -2403,7 +2358,6 @@
         <w:rPr>
           <w:rFonts w:ascii="Times New Roman" w:hAnsi="Times New Roman" w:cs="Times New Roman"/>
         </w:rPr>
-        <w:lastRenderedPageBreak/>
         <w:t>The final dataset was suitable for linear models, tree</w:t>
       </w:r>
       <w:r>
@@ -2506,6 +2460,7 @@
         <w:rPr>
           <w:rFonts w:ascii="Times New Roman" w:hAnsi="Times New Roman" w:cs="Times New Roman"/>
         </w:rPr>
+        <w:lastRenderedPageBreak/>
         <w:t>Decision Tree</w:t>
       </w:r>
     </w:p>
@@ -3261,7 +3216,6 @@
               <w:rPr>
                 <w:rFonts w:ascii="Times New Roman" w:hAnsi="Times New Roman" w:cs="Times New Roman"/>
               </w:rPr>
-              <w:lastRenderedPageBreak/>
               <w:t>Support Vector Regression</w:t>
             </w:r>
           </w:p>
@@ -3536,6 +3490,7 @@
         <w:rPr>
           <w:rFonts w:ascii="Times New Roman" w:hAnsi="Times New Roman" w:cs="Times New Roman"/>
         </w:rPr>
+        <w:lastRenderedPageBreak/>
         <w:t>Across all models, predictive performance remained limited. MAE values ranged from 8.02 to 9.52, and all R² values were negative or near zero, indicating that the available performance metrics contain weak predictive signal for forecasting next</w:t>
       </w:r>
       <w:r>
@@ -3596,13 +3551,7 @@
         <w:rPr>
           <w:rFonts w:ascii="Times New Roman" w:hAnsi="Times New Roman" w:cs="Times New Roman"/>
         </w:rPr>
-        <w:t>Figure 5: Best CV MAE Bar Chart</w:t>
-      </w:r>
-      <w:r>
-        <w:rPr>
-          <w:rFonts w:ascii="Times New Roman" w:hAnsi="Times New Roman" w:cs="Times New Roman"/>
-        </w:rPr>
-        <w:t xml:space="preserve"> </w:t>
+        <w:t xml:space="preserve">Figure 5: Best CV MAE Bar Chart </w:t>
       </w:r>
       <w:r>
         <w:rPr>
@@ -3734,7 +3683,6 @@
         <w:rPr>
           <w:rFonts w:ascii="Times New Roman" w:hAnsi="Times New Roman" w:cs="Times New Roman"/>
         </w:rPr>
-        <w:lastRenderedPageBreak/>
         <w:t>Although SVR achieved the lowest average MAE, the standard deviation across folds remained relatively high, indicating variability in model performance depending on the training split. This suggests that the model is not highly stable and that predictive performance is sensitive to data variation.</w:t>
       </w:r>
     </w:p>
@@ -3748,7 +3696,14 @@
         <w:rPr>
           <w:rFonts w:ascii="Times New Roman" w:hAnsi="Times New Roman" w:cs="Times New Roman"/>
         </w:rPr>
-        <w:t>While SVR achieved the lowest MAE, its negative R² indicates that it does not effectively explain the variance in the target variable. Therefore, although it performs best in terms of error minimization, its practical usefulness remains limited. This highlights the broader challenge of predicting games missed using only performance-based features.</w:t>
+        <w:t xml:space="preserve">While SVR achieved the lowest MAE, its negative R² indicates that it does not effectively explain the variance in the target variable. Therefore, although it performs best in terms of error </w:t>
+      </w:r>
+      <w:r>
+        <w:rPr>
+          <w:rFonts w:ascii="Times New Roman" w:hAnsi="Times New Roman" w:cs="Times New Roman"/>
+        </w:rPr>
+        <w:lastRenderedPageBreak/>
+        <w:t>minimization, its practical usefulness remains limited. This highlights the broader challenge of predicting games missed using only performance-based features.</w:t>
       </w:r>
     </w:p>
     <w:p>
@@ -3979,6 +3934,7 @@
           <w:rFonts w:ascii="Times New Roman" w:hAnsi="Times New Roman" w:cs="Times New Roman"/>
           <w:noProof/>
         </w:rPr>
+        <w:lastRenderedPageBreak/>
         <w:drawing>
           <wp:inline distT="0" distB="0" distL="0" distR="0" wp14:anchorId="06E0A11E" wp14:editId="79AD289A">
             <wp:extent cx="4692650" cy="2546295"/>
@@ -4171,7 +4127,6 @@
           <w:b/>
           <w:bCs/>
         </w:rPr>
-        <w:lastRenderedPageBreak/>
         <w:t>5. Conclusions and Next Steps</w:t>
       </w:r>
     </w:p>
@@ -4197,6 +4152,7 @@
         <w:rPr>
           <w:rFonts w:ascii="Times New Roman" w:hAnsi="Times New Roman" w:cs="Times New Roman"/>
         </w:rPr>
+        <w:lastRenderedPageBreak/>
         <w:br/>
         <w:t>The primary limitation of this study is the lack of injury-specific data. Games missed are influenced by factors such as injury history, physical condition, and external variables not captured in performance metrics.</w:t>
       </w:r>

</xml_diff>